<commit_message>
feat: align 2024 freelance order to MAFI Invoicing, Galaxent, and Bubble POS across route map, list view, and resume
</commit_message>
<xml_diff>
--- a/public/Mark_Reizel_Vincent_Palma_Resume.docx
+++ b/public/Mark_Reizel_Vincent_Palma_Resume.docx
@@ -667,25 +667,6 @@
           <w:b/>
           <w:sz w:val="18"/>
         </w:rPr>
-        <w:t xml:space="preserve">Bubble Hideout POS: </w:t>
-      </w:r>
-      <w:r>
-        <w:rPr>
-          <w:sz w:val="18"/>
-        </w:rPr>
-        <w:t>Engineered a standalone restaurant point-of-sale and live inventory management system in PHP/MySQL, eliminating dinner-rush order latency and automating daily cash-out reports.</w:t>
-      </w:r>
-    </w:p>
-    <w:p>
-      <w:pPr>
-        <w:pStyle w:val="ListBullet"/>
-        <w:spacing w:before="0" w:after="30" w:line="276" w:lineRule="auto"/>
-      </w:pPr>
-      <w:r>
-        <w:rPr>
-          <w:b/>
-          <w:sz w:val="18"/>
-        </w:rPr>
         <w:t xml:space="preserve">Michael Anthony's Fashion Inc. (MAFI): </w:t>
       </w:r>
       <w:r>
@@ -712,6 +693,25 @@
           <w:sz w:val="18"/>
         </w:rPr>
         <w:t>Designed and deployed an attendance logging and payroll calculation portal for retail personnel, reducing manual bi-weekly time reconciliation.</w:t>
+      </w:r>
+    </w:p>
+    <w:p>
+      <w:pPr>
+        <w:pStyle w:val="ListBullet"/>
+        <w:spacing w:before="0" w:after="30" w:line="276" w:lineRule="auto"/>
+      </w:pPr>
+      <w:r>
+        <w:rPr>
+          <w:b/>
+          <w:sz w:val="18"/>
+        </w:rPr>
+        <w:t xml:space="preserve">Bubble Hideout POS: </w:t>
+      </w:r>
+      <w:r>
+        <w:rPr>
+          <w:sz w:val="18"/>
+        </w:rPr>
+        <w:t>Engineered a standalone restaurant point-of-sale and live inventory management system in PHP/MySQL, eliminating dinner-rush order latency and automating daily cash-out reports.</w:t>
       </w:r>
     </w:p>
     <w:p>

</xml_diff>